<commit_message>
LEAF, AW changes, GCR fixes to stratification
</commit_message>
<xml_diff>
--- a/aw-models/aw_model_lay_overview.docx
+++ b/aw-models/aw_model_lay_overview.docx
@@ -55,7 +55,7 @@
         <w:rPr>
           <w:sz w:val="21"/>
         </w:rPr>
-        <w:t>Rethink Priorities evaluates animal welfare funds on behalf of Anthropic staff considering where to direct their personal philanthropy. This model estimates how many animal suffering-years are averted per $1 million donated to animal welfare funds. It uses Rethink Priorities' Cross-Cause Cost-Effectiveness Model (CCM) — one of the most detailed empirical estimates of animal welfare intervention effectiveness available — as its primary data source.</w:t>
+        <w:t>Rethink Priorities evaluates animal welfare funds on behalf of Anthropic staff considering where to direct their personal philanthropy. This model estimates how many animal suffering-years are averted per $1 million donated to animal welfare funds, using analyst-derived cost-effectiveness distributions for each intervention type.</w:t>
       </w:r>
     </w:p>
     <w:p>
@@ -89,7 +89,7 @@
         <w:rPr>
           <w:sz w:val="21"/>
         </w:rPr>
-        <w:t>Two funds are currently modelled, though the primary output used in downstream analysis is the Combined AW estimate, which represents the marginal impact of additional funding across all EA animal welfare funders.</w:t>
+        <w:t>Three funds are currently modelled:</w:t>
       </w:r>
     </w:p>
     <w:tbl>
@@ -99,15 +99,14 @@
         <w:tblLook w:firstColumn="1" w:firstRow="1" w:lastColumn="0" w:lastRow="0" w:noHBand="0" w:noVBand="1" w:val="04A0"/>
       </w:tblPr>
       <w:tblGrid>
-        <w:gridCol w:w="2266"/>
-        <w:gridCol w:w="2266"/>
-        <w:gridCol w:w="2266"/>
-        <w:gridCol w:w="2266"/>
+        <w:gridCol w:w="3022"/>
+        <w:gridCol w:w="3022"/>
+        <w:gridCol w:w="3022"/>
       </w:tblGrid>
       <w:tr>
         <w:tc>
           <w:tcPr>
-            <w:tcW w:type="dxa" w:w="2266"/>
+            <w:tcW w:type="dxa" w:w="3022"/>
             <w:shd w:val="clear" w:color="auto" w:fill="D2DCF0"/>
           </w:tcPr>
           <w:p>
@@ -123,7 +122,7 @@
         </w:tc>
         <w:tc>
           <w:tcPr>
-            <w:tcW w:type="dxa" w:w="2266"/>
+            <w:tcW w:type="dxa" w:w="3022"/>
             <w:shd w:val="clear" w:color="auto" w:fill="D2DCF0"/>
           </w:tcPr>
           <w:p>
@@ -139,23 +138,7 @@
         </w:tc>
         <w:tc>
           <w:tcPr>
-            <w:tcW w:type="dxa" w:w="2266"/>
-            <w:shd w:val="clear" w:color="auto" w:fill="D2DCF0"/>
-          </w:tcPr>
-          <w:p>
-            <w:r>
-              <w:rPr>
-                <w:b/>
-                <w:color w:val="1E3C78"/>
-                <w:sz w:val="19"/>
-              </w:rPr>
-              <w:t>Room for more funding</w:t>
-            </w:r>
-          </w:p>
-        </w:tc>
-        <w:tc>
-          <w:tcPr>
-            <w:tcW w:type="dxa" w:w="2266"/>
+            <w:tcW w:type="dxa" w:w="3022"/>
             <w:shd w:val="clear" w:color="auto" w:fill="D2DCF0"/>
           </w:tcPr>
           <w:p>
@@ -173,66 +156,8 @@
       <w:tr>
         <w:tc>
           <w:tcPr>
-            <w:tcW w:type="dxa" w:w="2266"/>
+            <w:tcW w:type="dxa" w:w="3022"/>
             <w:shd w:val="clear" w:color="auto" w:fill="F5F7FC"/>
-          </w:tcPr>
-          <w:p>
-            <w:r>
-              <w:rPr>
-                <w:sz w:val="19"/>
-              </w:rPr>
-              <w:t>Combined AW Funds (Marginal)</w:t>
-            </w:r>
-          </w:p>
-        </w:tc>
-        <w:tc>
-          <w:tcPr>
-            <w:tcW w:type="dxa" w:w="2266"/>
-            <w:shd w:val="clear" w:color="auto" w:fill="F5F7FC"/>
-          </w:tcPr>
-          <w:p>
-            <w:r>
-              <w:rPr>
-                <w:sz w:val="19"/>
-              </w:rPr>
-              <w:t>$26.5M/yr</w:t>
-            </w:r>
-          </w:p>
-        </w:tc>
-        <w:tc>
-          <w:tcPr>
-            <w:tcW w:type="dxa" w:w="2266"/>
-            <w:shd w:val="clear" w:color="auto" w:fill="F5F7FC"/>
-          </w:tcPr>
-          <w:p>
-            <w:r>
-              <w:rPr>
-                <w:sz w:val="19"/>
-              </w:rPr>
-              <w:t>$79.3M</w:t>
-            </w:r>
-          </w:p>
-        </w:tc>
-        <w:tc>
-          <w:tcPr>
-            <w:tcW w:type="dxa" w:w="2266"/>
-            <w:shd w:val="clear" w:color="auto" w:fill="F5F7FC"/>
-          </w:tcPr>
-          <w:p>
-            <w:r>
-              <w:rPr>
-                <w:sz w:val="19"/>
-              </w:rPr>
-              <w:t>Weighted aggregate of all EA AW funds; reflects how the next marginal dollar would likely be deployed across the field</w:t>
-            </w:r>
-          </w:p>
-        </w:tc>
-      </w:tr>
-      <w:tr>
-        <w:tc>
-          <w:tcPr>
-            <w:tcW w:type="dxa" w:w="2266"/>
-            <w:shd w:val="clear" w:color="auto" w:fill="FFFFFF"/>
           </w:tcPr>
           <w:p>
             <w:r>
@@ -245,7 +170,37 @@
         </w:tc>
         <w:tc>
           <w:tcPr>
-            <w:tcW w:type="dxa" w:w="2266"/>
+            <w:tcW w:type="dxa" w:w="3022"/>
+            <w:shd w:val="clear" w:color="auto" w:fill="F5F7FC"/>
+          </w:tcPr>
+          <w:p>
+            <w:r>
+              <w:rPr>
+                <w:sz w:val="19"/>
+              </w:rPr>
+              <w:t>$7.0M/yr</w:t>
+            </w:r>
+          </w:p>
+        </w:tc>
+        <w:tc>
+          <w:tcPr>
+            <w:tcW w:type="dxa" w:w="3022"/>
+            <w:shd w:val="clear" w:color="auto" w:fill="F5F7FC"/>
+          </w:tcPr>
+          <w:p>
+            <w:r>
+              <w:rPr>
+                <w:sz w:val="19"/>
+              </w:rPr>
+              <w:t>EA Animal Welfare Fund; a re-granting fund that distributes to effective animal welfare organisations worldwide</w:t>
+            </w:r>
+          </w:p>
+        </w:tc>
+      </w:tr>
+      <w:tr>
+        <w:tc>
+          <w:tcPr>
+            <w:tcW w:type="dxa" w:w="3022"/>
             <w:shd w:val="clear" w:color="auto" w:fill="FFFFFF"/>
           </w:tcPr>
           <w:p>
@@ -253,13 +208,13 @@
               <w:rPr>
                 <w:sz w:val="19"/>
               </w:rPr>
-              <w:t>$3.7M/yr</w:t>
+              <w:t>Navigation Fund â€” Cage-Free Accountability</w:t>
             </w:r>
           </w:p>
         </w:tc>
         <w:tc>
           <w:tcPr>
-            <w:tcW w:type="dxa" w:w="2266"/>
+            <w:tcW w:type="dxa" w:w="3022"/>
             <w:shd w:val="clear" w:color="auto" w:fill="FFFFFF"/>
           </w:tcPr>
           <w:p>
@@ -267,13 +222,13 @@
               <w:rPr>
                 <w:sz w:val="19"/>
               </w:rPr>
-              <w:t>$6.3M</w:t>
+              <w:t>$6.15M/yr</w:t>
             </w:r>
           </w:p>
         </w:tc>
         <w:tc>
           <w:tcPr>
-            <w:tcW w:type="dxa" w:w="2266"/>
+            <w:tcW w:type="dxa" w:w="3022"/>
             <w:shd w:val="clear" w:color="auto" w:fill="FFFFFF"/>
           </w:tcPr>
           <w:p>
@@ -281,7 +236,51 @@
               <w:rPr>
                 <w:sz w:val="19"/>
               </w:rPr>
-              <w:t>EA Animal Welfare Fund; a re-granting fund that distributes to effective animal welfare organisations worldwide</w:t>
+              <w:t>Navigation Fund cage-free sub-portfolio; focused on corporate and political strategies to end cages for layer hens</w:t>
+            </w:r>
+          </w:p>
+        </w:tc>
+      </w:tr>
+      <w:tr>
+        <w:tc>
+          <w:tcPr>
+            <w:tcW w:type="dxa" w:w="3022"/>
+            <w:shd w:val="clear" w:color="auto" w:fill="F5F7FC"/>
+          </w:tcPr>
+          <w:p>
+            <w:r>
+              <w:rPr>
+                <w:sz w:val="19"/>
+              </w:rPr>
+              <w:t>Navigation Fund â€” General Farm Animal</w:t>
+            </w:r>
+          </w:p>
+        </w:tc>
+        <w:tc>
+          <w:tcPr>
+            <w:tcW w:type="dxa" w:w="3022"/>
+            <w:shd w:val="clear" w:color="auto" w:fill="F5F7FC"/>
+          </w:tcPr>
+          <w:p>
+            <w:r>
+              <w:rPr>
+                <w:sz w:val="19"/>
+              </w:rPr>
+              <w:t>$16.7M/yr</w:t>
+            </w:r>
+          </w:p>
+        </w:tc>
+        <w:tc>
+          <w:tcPr>
+            <w:tcW w:type="dxa" w:w="3022"/>
+            <w:shd w:val="clear" w:color="auto" w:fill="F5F7FC"/>
+          </w:tcPr>
+          <w:p>
+            <w:r>
+              <w:rPr>
+                <w:sz w:val="19"/>
+              </w:rPr>
+              <w:t>Navigation Fund general farm animal grantmaking across species and regions</w:t>
             </w:r>
           </w:p>
         </w:tc>
@@ -540,7 +539,7 @@
               <w:rPr>
                 <w:sz w:val="19"/>
               </w:rPr>
-              <w:t>Median 85,938 / mean 108,071 aDALYs per $1M</w:t>
+              <w:t>—</w:t>
             </w:r>
           </w:p>
         </w:tc>
@@ -554,7 +553,7 @@
               <w:rPr>
                 <w:sz w:val="19"/>
               </w:rPr>
-              <w:t>15 years</w:t>
+              <w:t>? years</w:t>
             </w:r>
           </w:p>
         </w:tc>
@@ -824,7 +823,7 @@
         <w:pStyle w:val="Heading1"/>
       </w:pPr>
       <w:r>
-        <w:t>4.  Where the estimates come from: the Cross-Cause Model</w:t>
+        <w:t>4.  Where the estimates come from</w:t>
       </w:r>
     </w:p>
     <w:p>
@@ -835,7 +834,7 @@
         <w:rPr>
           <w:sz w:val="21"/>
         </w:rPr>
-        <w:t>The effectiveness numbers come from Rethink Priorities' Cross-Cause Cost-Effectiveness Model (CCM). The CCM synthesises the best available evidence on each intervention — field studies, expert surveys, and meta-analyses — and produces a full distribution of plausible cost-effectiveness estimates, not just a single point.</w:t>
+        <w:t>The effectiveness numbers come from analyst-derived distributions built by Rethink Priorities. For each intervention, the model synthesises the best available evidence — field studies, expert surveys, and meta-analyses — and produces a full distribution of plausible cost-effectiveness estimates, not just a single point.</w:t>
       </w:r>
     </w:p>
     <w:p>
@@ -846,7 +845,7 @@
         <w:rPr>
           <w:sz w:val="21"/>
         </w:rPr>
-        <w:t>For each intervention, the CCM provides 100,000 random samples of 'animal suffering-years averted per $1,000 spent.' These samples capture everything we know and don't know about how effective each intervention is. The wide spreads reflect genuine uncertainty — we simply don't have precise data on, for example, exactly how many chickens are affected by a successful cage-free campaign.</w:t>
+        <w:t>For each intervention, 100,000 random samples of 'animal suffering-years averted per $1,000 spent' are drawn. These samples capture everything we know and don't know about how effective each intervention is. The wide spreads reflect genuine uncertainty — we simply don't have precise data on, for example, exactly how many chickens are affected by a successful cage-free campaign.</w:t>
       </w:r>
     </w:p>
     <w:p>
@@ -861,7 +860,7 @@
           <w:color w:val="1A5C82"/>
           <w:sz w:val="20"/>
         </w:rPr>
-        <w:t>These are animal suffering-years, not human-equivalent DALYs. The CCM assigns each species a 'sentience weight' based on evidence about their capacity for conscious experience. This model uses the pre-weight values; the cross-cause moral weighting step (applied downstream) converts them to a comparable basis with human welfare.</w:t>
+        <w:t>These are animal suffering-years, not human-equivalent DALYs. This model uses pre-moral-weight values; the cross-cause moral weighting step (applied downstream) converts them to a comparable basis with human welfare.</w:t>
       </w:r>
     </w:p>
     <w:p>
@@ -872,7 +871,7 @@
         <w:rPr>
           <w:sz w:val="21"/>
         </w:rPr>
-        <w:t>To give a sense of the uncertainty involved, here are CCM estimates for the two largest interventions:</w:t>
+        <w:t>To give a sense of the uncertainty involved, here are estimates for the two largest interventions:</w:t>
       </w:r>
     </w:p>
     <w:tbl>
@@ -1122,7 +1121,7 @@
         <w:rPr>
           <w:sz w:val="21"/>
         </w:rPr>
-        <w:t>Table: Chicken corporate campaigns (CCM uncertainty at fund share 51%)</w:t>
+        <w:t>Table: Chicken corporate campaigns (uncertainty at fund share 51%)</w:t>
       </w:r>
     </w:p>
     <w:p/>
@@ -1373,7 +1372,7 @@
         <w:rPr>
           <w:sz w:val="21"/>
         </w:rPr>
-        <w:t>Table: Movement building (CCM uncertainty at fund share 23%)</w:t>
+        <w:t>Table: Movement building (uncertainty at fund share 23%)</w:t>
       </w:r>
     </w:p>
     <w:p/>
@@ -1404,7 +1403,7 @@
         <w:rPr>
           <w:sz w:val="21"/>
         </w:rPr>
-        <w:t>Each CCM intervention specifies two timing parameters:</w:t>
+        <w:t>Each intervention specifies two timing parameters:</w:t>
       </w:r>
     </w:p>
     <w:p>
@@ -1661,7 +1660,7 @@
               <w:rPr>
                 <w:sz w:val="19"/>
               </w:rPr>
-              <w:t>Policy advocacy</w:t>
+              <w:t>Fish welfare</w:t>
             </w:r>
           </w:p>
         </w:tc>
@@ -1675,7 +1674,7 @@
               <w:rPr>
                 <w:sz w:val="19"/>
               </w:rPr>
-              <w:t>Year 4</w:t>
+              <w:t>Year 1</w:t>
             </w:r>
           </w:p>
         </w:tc>
@@ -1689,7 +1688,7 @@
               <w:rPr>
                 <w:sz w:val="19"/>
               </w:rPr>
-              <w:t>15 years</w:t>
+              <w:t>10 years</w:t>
             </w:r>
           </w:p>
         </w:tc>
@@ -1719,7 +1718,7 @@
               <w:rPr>
                 <w:sz w:val="19"/>
               </w:rPr>
-              <w:t>Fish welfare</w:t>
+              <w:t>Shrimp welfare</w:t>
             </w:r>
           </w:p>
         </w:tc>
@@ -1777,7 +1776,7 @@
               <w:rPr>
                 <w:sz w:val="19"/>
               </w:rPr>
-              <w:t>Shrimp welfare</w:t>
+              <w:t>Wild animal welfare</w:t>
             </w:r>
           </w:p>
         </w:tc>
@@ -1791,7 +1790,7 @@
               <w:rPr>
                 <w:sz w:val="19"/>
               </w:rPr>
-              <w:t>Year 1</w:t>
+              <w:t>Year 10</w:t>
             </w:r>
           </w:p>
         </w:tc>
@@ -1835,7 +1834,7 @@
               <w:rPr>
                 <w:sz w:val="19"/>
               </w:rPr>
-              <w:t>Wild animal welfare</w:t>
+              <w:t>Invertebrate welfare</w:t>
             </w:r>
           </w:p>
         </w:tc>
@@ -1882,64 +1881,6 @@
           </w:p>
         </w:tc>
       </w:tr>
-      <w:tr>
-        <w:tc>
-          <w:tcPr>
-            <w:tcW w:type="dxa" w:w="2266"/>
-            <w:shd w:val="clear" w:color="auto" w:fill="F5F7FC"/>
-          </w:tcPr>
-          <w:p>
-            <w:r>
-              <w:rPr>
-                <w:sz w:val="19"/>
-              </w:rPr>
-              <w:t>Invertebrate welfare</w:t>
-            </w:r>
-          </w:p>
-        </w:tc>
-        <w:tc>
-          <w:tcPr>
-            <w:tcW w:type="dxa" w:w="2266"/>
-            <w:shd w:val="clear" w:color="auto" w:fill="F5F7FC"/>
-          </w:tcPr>
-          <w:p>
-            <w:r>
-              <w:rPr>
-                <w:sz w:val="19"/>
-              </w:rPr>
-              <w:t>Year 10</w:t>
-            </w:r>
-          </w:p>
-        </w:tc>
-        <w:tc>
-          <w:tcPr>
-            <w:tcW w:type="dxa" w:w="2266"/>
-            <w:shd w:val="clear" w:color="auto" w:fill="F5F7FC"/>
-          </w:tcPr>
-          <w:p>
-            <w:r>
-              <w:rPr>
-                <w:sz w:val="19"/>
-              </w:rPr>
-              <w:t>10 years</w:t>
-            </w:r>
-          </w:p>
-        </w:tc>
-        <w:tc>
-          <w:tcPr>
-            <w:tcW w:type="dxa" w:w="2266"/>
-            <w:shd w:val="clear" w:color="auto" w:fill="F5F7FC"/>
-          </w:tcPr>
-          <w:p>
-            <w:r>
-              <w:rPr>
-                <w:sz w:val="19"/>
-              </w:rPr>
-              <w:t>0–5 yr, 5–10 yr, 10–20 yr (proportionally)</w:t>
-            </w:r>
-          </w:p>
-        </w:tc>
-      </w:tr>
     </w:tbl>
     <w:p/>
     <w:p>
@@ -1954,7 +1895,7 @@
           <w:color w:val="503C00"/>
           <w:sz w:val="20"/>
         </w:rPr>
-        <w:t>Note: All current AW interventions have their effects entirely within the first 20 years. The t3 (20–100 yr), t4 (100–500 yr), and t5 (500+ yr) columns are zero for all AW interventions. This contrasts sharply with GCR models, where the entire value of survival extends across all of human (and post-human) history.</w:t>
+        <w:t>Note: The AW model uses four time windows: 0–5, 5–10, 10–20, and 20–100 years. All current AW interventions have their effects within this 100-year horizon — the model does not include a 100–500 year or 500+ year window for animal welfare. This contrasts sharply with GCR models, where the entire value of survival extends across all of human (and post-human) history.</w:t>
       </w:r>
     </w:p>
     <w:p>
@@ -1973,7 +1914,18 @@
         <w:rPr>
           <w:sz w:val="21"/>
         </w:rPr>
-        <w:t>Animal welfare organisations have limited absorptive capacity — there are only so many high-quality cage-free campaigns to run, so many lobbyists to hire, and so much movement infrastructure to build. The model therefore adjusts cost-effectiveness downward as the total budget grows:</w:t>
+        <w:t>Animal welfare organisations have limited absorptive capacity — there are only so many high-quality cage-free campaigns to run, so many lobbyists to hire, and so much movement infrastructure to build. The model now includes a formal diminishing returns curve for the combined AW fund, based on analyst estimates of how marginal cost-effectiveness changes as total funding increases.</w:t>
+      </w:r>
+    </w:p>
+    <w:p>
+      <w:pPr>
+        <w:spacing w:after="100"/>
+      </w:pPr>
+      <w:r>
+        <w:rPr>
+          <w:sz w:val="21"/>
+        </w:rPr>
+        <w:t>The curve is parameterised by anchor points that specify CE as a fraction of baseline at different cumulative spend levels. The combined AW fund has an estimated room for more funding (RFMF) of $79.3M — this is the total amount the market can absorb while maintaining meaningful cost-effectiveness.</w:t>
       </w:r>
     </w:p>
     <w:tbl>
@@ -1999,7 +1951,7 @@
                 <w:color w:val="1E3C78"/>
                 <w:sz w:val="19"/>
               </w:rPr>
-              <w:t>Budget level (cumulative)</w:t>
+              <w:t>Cumulative spend</w:t>
             </w:r>
           </w:p>
         </w:tc>
@@ -2015,7 +1967,7 @@
                 <w:color w:val="1E3C78"/>
                 <w:sz w:val="19"/>
               </w:rPr>
-              <w:t>Marginal CE as fraction of baseline</w:t>
+              <w:t>Marginal CE (relative to baseline)</w:t>
             </w:r>
           </w:p>
         </w:tc>
@@ -2031,7 +1983,7 @@
               <w:rPr>
                 <w:sz w:val="19"/>
               </w:rPr>
-              <w:t>$10.0M</w:t>
+              <w:t>$10M</w:t>
             </w:r>
           </w:p>
         </w:tc>
@@ -2061,7 +2013,7 @@
               <w:rPr>
                 <w:sz w:val="19"/>
               </w:rPr>
-              <w:t>$26.5M</w:t>
+              <w:t>$26M</w:t>
             </w:r>
           </w:p>
         </w:tc>
@@ -2091,7 +2043,7 @@
               <w:rPr>
                 <w:sz w:val="19"/>
               </w:rPr>
-              <w:t>$55.0M</w:t>
+              <w:t>$55M</w:t>
             </w:r>
           </w:p>
         </w:tc>
@@ -2121,7 +2073,7 @@
               <w:rPr>
                 <w:sz w:val="19"/>
               </w:rPr>
-              <w:t>$100.0M</w:t>
+              <w:t>$100M</w:t>
             </w:r>
           </w:p>
         </w:tc>
@@ -2151,7 +2103,7 @@
               <w:rPr>
                 <w:sz w:val="19"/>
               </w:rPr>
-              <w:t>$160.0M</w:t>
+              <w:t>$160M</w:t>
             </w:r>
           </w:p>
         </w:tc>
@@ -2180,7 +2132,22 @@
         <w:rPr>
           <w:sz w:val="21"/>
         </w:rPr>
-        <w:t>For example, the combined AW fund maintains close to baseline cost-effectiveness up to about $55M, then drops more steeply as the field becomes saturated relative to what can be productively deployed. Beyond the final anchor point, the model assumes cost-effectiveness falls as 1/(budget scale), reflecting increasing difficulty of finding additional high-quality opportunities.</w:t>
+        <w:t>For example, if you are the only funder up to $10M, you get the full (baseline) CE. As total giving scales toward the RFMF and beyond, the marginal impact of each additional dollar declines. Beyond the last anchor, the curve continues to fall following a 1/x hyperbolic trajectory — cost-effectiveness keeps declining but never reaches zero.</w:t>
+      </w:r>
+    </w:p>
+    <w:p>
+      <w:pPr>
+        <w:spacing w:before="100" w:after="160"/>
+        <w:ind w:left="283" w:right="283"/>
+        <w:shd w:val="clear" w:color="auto" w:fill="FFFADC"/>
+      </w:pPr>
+      <w:r>
+        <w:rPr>
+          <w:i/>
+          <w:color w:val="503C00"/>
+          <w:sz w:val="20"/>
+        </w:rPr>
+        <w:t>Note: These anchor points are rough analyst estimates based on conversations with fund managers about absorptive capacity. They should be treated as indicative rather than precise.</w:t>
       </w:r>
     </w:p>
     <w:p>
@@ -2199,7 +2166,7 @@
         <w:rPr>
           <w:sz w:val="21"/>
         </w:rPr>
-        <w:t>Because the CCM provides 100,000 samples per intervention (capturing the full distribution from pessimistic to optimistic), we can ask: how should we summarise this distribution? Different ethical frameworks disagree.</w:t>
+        <w:t>Because the model provides 100,000 samples per intervention (capturing the full distribution from pessimistic to optimistic), we can ask: how should we summarise this distribution? Different ethical frameworks disagree.</w:t>
       </w:r>
     </w:p>
     <w:p>
@@ -2642,7 +2609,7 @@
         <w:rPr>
           <w:sz w:val="21"/>
         </w:rPr>
-        <w:t>CCM estimates are derived from limited empirical evidence. Corporate campaigns in particular rely heavily on extrapolation from a small number of documented successes. The wide confidence intervals reflect genuine ignorance, not well-characterised uncertainty.</w:t>
+        <w:t>Estimates are derived from limited empirical evidence. Corporate campaigns in particular rely heavily on extrapolation from a small number of documented successes. The wide confidence intervals reflect genuine ignorance, not well-characterised uncertainty.</w:t>
       </w:r>
     </w:p>
     <w:p>
@@ -2717,14 +2684,15 @@
         <w:tblLook w:firstColumn="1" w:firstRow="1" w:lastColumn="0" w:lastRow="0" w:noHBand="0" w:noVBand="1" w:val="04A0"/>
       </w:tblPr>
       <w:tblGrid>
-        <w:gridCol w:w="3022"/>
-        <w:gridCol w:w="3022"/>
-        <w:gridCol w:w="3022"/>
+        <w:gridCol w:w="2266"/>
+        <w:gridCol w:w="2266"/>
+        <w:gridCol w:w="2266"/>
+        <w:gridCol w:w="2266"/>
       </w:tblGrid>
       <w:tr>
         <w:tc>
           <w:tcPr>
-            <w:tcW w:type="dxa" w:w="3022"/>
+            <w:tcW w:type="dxa" w:w="2266"/>
             <w:shd w:val="clear" w:color="auto" w:fill="D2DCF0"/>
           </w:tcPr>
           <w:p>
@@ -2740,7 +2708,7 @@
         </w:tc>
         <w:tc>
           <w:tcPr>
-            <w:tcW w:type="dxa" w:w="3022"/>
+            <w:tcW w:type="dxa" w:w="2266"/>
             <w:shd w:val="clear" w:color="auto" w:fill="D2DCF0"/>
           </w:tcPr>
           <w:p>
@@ -2750,13 +2718,13 @@
                 <w:color w:val="1E3C78"/>
                 <w:sz w:val="19"/>
               </w:rPr>
-              <w:t>Combined AW fund</w:t>
+              <w:t>EA AWF</w:t>
             </w:r>
           </w:p>
         </w:tc>
         <w:tc>
           <w:tcPr>
-            <w:tcW w:type="dxa" w:w="3022"/>
+            <w:tcW w:type="dxa" w:w="2266"/>
             <w:shd w:val="clear" w:color="auto" w:fill="D2DCF0"/>
           </w:tcPr>
           <w:p>
@@ -2766,7 +2734,23 @@
                 <w:color w:val="1E3C78"/>
                 <w:sz w:val="19"/>
               </w:rPr>
-              <w:t>EA Animal Welfare Fund</w:t>
+              <w:t>Nav Fund — Cage-Free</w:t>
+            </w:r>
+          </w:p>
+        </w:tc>
+        <w:tc>
+          <w:tcPr>
+            <w:tcW w:type="dxa" w:w="2266"/>
+            <w:shd w:val="clear" w:color="auto" w:fill="D2DCF0"/>
+          </w:tcPr>
+          <w:p>
+            <w:r>
+              <w:rPr>
+                <w:b/>
+                <w:color w:val="1E3C78"/>
+                <w:sz w:val="19"/>
+              </w:rPr>
+              <w:t>Nav Fund — General</w:t>
             </w:r>
           </w:p>
         </w:tc>
@@ -2774,7 +2758,7 @@
       <w:tr>
         <w:tc>
           <w:tcPr>
-            <w:tcW w:type="dxa" w:w="3022"/>
+            <w:tcW w:type="dxa" w:w="2266"/>
             <w:shd w:val="clear" w:color="auto" w:fill="F5F7FC"/>
           </w:tcPr>
           <w:p>
@@ -2788,7 +2772,7 @@
         </w:tc>
         <w:tc>
           <w:tcPr>
-            <w:tcW w:type="dxa" w:w="3022"/>
+            <w:tcW w:type="dxa" w:w="2266"/>
             <w:shd w:val="clear" w:color="auto" w:fill="F5F7FC"/>
           </w:tcPr>
           <w:p>
@@ -2796,13 +2780,13 @@
               <w:rPr>
                 <w:sz w:val="19"/>
               </w:rPr>
-              <w:t>$26.5M</w:t>
+              <w:t>$7.0M</w:t>
             </w:r>
           </w:p>
         </w:tc>
         <w:tc>
           <w:tcPr>
-            <w:tcW w:type="dxa" w:w="3022"/>
+            <w:tcW w:type="dxa" w:w="2266"/>
             <w:shd w:val="clear" w:color="auto" w:fill="F5F7FC"/>
           </w:tcPr>
           <w:p>
@@ -2810,7 +2794,21 @@
               <w:rPr>
                 <w:sz w:val="19"/>
               </w:rPr>
-              <w:t>$3.7M</w:t>
+              <w:t>$6.15M</w:t>
+            </w:r>
+          </w:p>
+        </w:tc>
+        <w:tc>
+          <w:tcPr>
+            <w:tcW w:type="dxa" w:w="2266"/>
+            <w:shd w:val="clear" w:color="auto" w:fill="F5F7FC"/>
+          </w:tcPr>
+          <w:p>
+            <w:r>
+              <w:rPr>
+                <w:sz w:val="19"/>
+              </w:rPr>
+              <w:t>$16.7M</w:t>
             </w:r>
           </w:p>
         </w:tc>
@@ -2818,52 +2816,8 @@
       <w:tr>
         <w:tc>
           <w:tcPr>
-            <w:tcW w:type="dxa" w:w="3022"/>
+            <w:tcW w:type="dxa" w:w="2266"/>
             <w:shd w:val="clear" w:color="auto" w:fill="FFFFFF"/>
-          </w:tcPr>
-          <w:p>
-            <w:r>
-              <w:rPr>
-                <w:sz w:val="19"/>
-              </w:rPr>
-              <w:t>Room for more funding</w:t>
-            </w:r>
-          </w:p>
-        </w:tc>
-        <w:tc>
-          <w:tcPr>
-            <w:tcW w:type="dxa" w:w="3022"/>
-            <w:shd w:val="clear" w:color="auto" w:fill="FFFFFF"/>
-          </w:tcPr>
-          <w:p>
-            <w:r>
-              <w:rPr>
-                <w:sz w:val="19"/>
-              </w:rPr>
-              <w:t>$79.3M</w:t>
-            </w:r>
-          </w:p>
-        </w:tc>
-        <w:tc>
-          <w:tcPr>
-            <w:tcW w:type="dxa" w:w="3022"/>
-            <w:shd w:val="clear" w:color="auto" w:fill="FFFFFF"/>
-          </w:tcPr>
-          <w:p>
-            <w:r>
-              <w:rPr>
-                <w:sz w:val="19"/>
-              </w:rPr>
-              <w:t>$6.3M</w:t>
-            </w:r>
-          </w:p>
-        </w:tc>
-      </w:tr>
-      <w:tr>
-        <w:tc>
-          <w:tcPr>
-            <w:tcW w:type="dxa" w:w="3022"/>
-            <w:shd w:val="clear" w:color="auto" w:fill="F5F7FC"/>
           </w:tcPr>
           <w:p>
             <w:r>
@@ -2876,8 +2830,8 @@
         </w:tc>
         <w:tc>
           <w:tcPr>
-            <w:tcW w:type="dxa" w:w="3022"/>
-            <w:shd w:val="clear" w:color="auto" w:fill="F5F7FC"/>
+            <w:tcW w:type="dxa" w:w="2266"/>
+            <w:shd w:val="clear" w:color="auto" w:fill="FFFFFF"/>
           </w:tcPr>
           <w:p>
             <w:r>
@@ -2890,8 +2844,22 @@
         </w:tc>
         <w:tc>
           <w:tcPr>
-            <w:tcW w:type="dxa" w:w="3022"/>
-            <w:shd w:val="clear" w:color="auto" w:fill="F5F7FC"/>
+            <w:tcW w:type="dxa" w:w="2266"/>
+            <w:shd w:val="clear" w:color="auto" w:fill="FFFFFF"/>
+          </w:tcPr>
+          <w:p>
+            <w:r>
+              <w:rPr>
+                <w:sz w:val="19"/>
+              </w:rPr>
+              <w:t>1</w:t>
+            </w:r>
+          </w:p>
+        </w:tc>
+        <w:tc>
+          <w:tcPr>
+            <w:tcW w:type="dxa" w:w="2266"/>
+            <w:shd w:val="clear" w:color="auto" w:fill="FFFFFF"/>
           </w:tcPr>
           <w:p>
             <w:r>
@@ -2906,7 +2874,65 @@
       <w:tr>
         <w:tc>
           <w:tcPr>
-            <w:tcW w:type="dxa" w:w="3022"/>
+            <w:tcW w:type="dxa" w:w="2266"/>
+            <w:shd w:val="clear" w:color="auto" w:fill="F5F7FC"/>
+          </w:tcPr>
+          <w:p>
+            <w:r>
+              <w:rPr>
+                <w:sz w:val="19"/>
+              </w:rPr>
+              <w:t>Largest intervention (by share)</w:t>
+            </w:r>
+          </w:p>
+        </w:tc>
+        <w:tc>
+          <w:tcPr>
+            <w:tcW w:type="dxa" w:w="2266"/>
+            <w:shd w:val="clear" w:color="auto" w:fill="F5F7FC"/>
+          </w:tcPr>
+          <w:p>
+            <w:r>
+              <w:rPr>
+                <w:sz w:val="19"/>
+              </w:rPr>
+              <w:t>chicken corporate campaigns</w:t>
+            </w:r>
+          </w:p>
+        </w:tc>
+        <w:tc>
+          <w:tcPr>
+            <w:tcW w:type="dxa" w:w="2266"/>
+            <w:shd w:val="clear" w:color="auto" w:fill="F5F7FC"/>
+          </w:tcPr>
+          <w:p>
+            <w:r>
+              <w:rPr>
+                <w:sz w:val="19"/>
+              </w:rPr>
+              <w:t>chicken corporate campaigns</w:t>
+            </w:r>
+          </w:p>
+        </w:tc>
+        <w:tc>
+          <w:tcPr>
+            <w:tcW w:type="dxa" w:w="2266"/>
+            <w:shd w:val="clear" w:color="auto" w:fill="F5F7FC"/>
+          </w:tcPr>
+          <w:p>
+            <w:r>
+              <w:rPr>
+                <w:sz w:val="19"/>
+              </w:rPr>
+              <w:t>movement building</w:t>
+            </w:r>
+          </w:p>
+        </w:tc>
+      </w:tr>
+      <w:tr>
+        <w:tc>
+          <w:tcPr>
+            <w:tcW w:type="dxa" w:w="2266"/>
             <w:shd w:val="clear" w:color="auto" w:fill="FFFFFF"/>
           </w:tcPr>
           <w:p>
@@ -2914,58 +2940,14 @@
               <w:rPr>
                 <w:sz w:val="19"/>
               </w:rPr>
-              <w:t>Largest single intervention (by budget share)</w:t>
+              <w:t>Samples per intervention</w:t>
             </w:r>
           </w:p>
         </w:tc>
         <w:tc>
           <w:tcPr>
-            <w:tcW w:type="dxa" w:w="3022"/>
+            <w:tcW w:type="dxa" w:w="2266"/>
             <w:shd w:val="clear" w:color="auto" w:fill="FFFFFF"/>
-          </w:tcPr>
-          <w:p>
-            <w:r>
-              <w:rPr>
-                <w:sz w:val="19"/>
-              </w:rPr>
-              <w:t>Chicken corporate campaigns (51%)</w:t>
-            </w:r>
-          </w:p>
-        </w:tc>
-        <w:tc>
-          <w:tcPr>
-            <w:tcW w:type="dxa" w:w="3022"/>
-            <w:shd w:val="clear" w:color="auto" w:fill="FFFFFF"/>
-          </w:tcPr>
-          <w:p>
-            <w:r>
-              <w:rPr>
-                <w:sz w:val="19"/>
-              </w:rPr>
-              <w:t>Chicken corporate campaigns (35%)</w:t>
-            </w:r>
-          </w:p>
-        </w:tc>
-      </w:tr>
-      <w:tr>
-        <w:tc>
-          <w:tcPr>
-            <w:tcW w:type="dxa" w:w="3022"/>
-            <w:shd w:val="clear" w:color="auto" w:fill="F5F7FC"/>
-          </w:tcPr>
-          <w:p>
-            <w:r>
-              <w:rPr>
-                <w:sz w:val="19"/>
-              </w:rPr>
-              <w:t>CCM samples per intervention</w:t>
-            </w:r>
-          </w:p>
-        </w:tc>
-        <w:tc>
-          <w:tcPr>
-            <w:tcW w:type="dxa" w:w="3022"/>
-            <w:shd w:val="clear" w:color="auto" w:fill="F5F7FC"/>
           </w:tcPr>
           <w:p>
             <w:r>
@@ -2978,8 +2960,22 @@
         </w:tc>
         <w:tc>
           <w:tcPr>
-            <w:tcW w:type="dxa" w:w="3022"/>
-            <w:shd w:val="clear" w:color="auto" w:fill="F5F7FC"/>
+            <w:tcW w:type="dxa" w:w="2266"/>
+            <w:shd w:val="clear" w:color="auto" w:fill="FFFFFF"/>
+          </w:tcPr>
+          <w:p>
+            <w:r>
+              <w:rPr>
+                <w:sz w:val="19"/>
+              </w:rPr>
+              <w:t>100,000 (full) or 10,000 (fallback)</w:t>
+            </w:r>
+          </w:p>
+        </w:tc>
+        <w:tc>
+          <w:tcPr>
+            <w:tcW w:type="dxa" w:w="2266"/>
+            <w:shd w:val="clear" w:color="auto" w:fill="FFFFFF"/>
           </w:tcPr>
           <w:p>
             <w:r>
@@ -2994,8 +2990,8 @@
       <w:tr>
         <w:tc>
           <w:tcPr>
-            <w:tcW w:type="dxa" w:w="3022"/>
-            <w:shd w:val="clear" w:color="auto" w:fill="FFFFFF"/>
+            <w:tcW w:type="dxa" w:w="2266"/>
+            <w:shd w:val="clear" w:color="auto" w:fill="F5F7FC"/>
           </w:tcPr>
           <w:p>
             <w:r>
@@ -3008,8 +3004,8 @@
         </w:tc>
         <w:tc>
           <w:tcPr>
-            <w:tcW w:type="dxa" w:w="3022"/>
-            <w:shd w:val="clear" w:color="auto" w:fill="FFFFFF"/>
+            <w:tcW w:type="dxa" w:w="2266"/>
+            <w:shd w:val="clear" w:color="auto" w:fill="F5F7FC"/>
           </w:tcPr>
           <w:p>
             <w:r>
@@ -3022,8 +3018,22 @@
         </w:tc>
         <w:tc>
           <w:tcPr>
-            <w:tcW w:type="dxa" w:w="3022"/>
-            <w:shd w:val="clear" w:color="auto" w:fill="FFFFFF"/>
+            <w:tcW w:type="dxa" w:w="2266"/>
+            <w:shd w:val="clear" w:color="auto" w:fill="F5F7FC"/>
+          </w:tcPr>
+          <w:p>
+            <w:r>
+              <w:rPr>
+                <w:sz w:val="19"/>
+              </w:rPr>
+              <w:t>0–20 years</w:t>
+            </w:r>
+          </w:p>
+        </w:tc>
+        <w:tc>
+          <w:tcPr>
+            <w:tcW w:type="dxa" w:w="2266"/>
+            <w:shd w:val="clear" w:color="auto" w:fill="F5F7FC"/>
           </w:tcPr>
           <w:p>
             <w:r>
@@ -3038,8 +3048,8 @@
       <w:tr>
         <w:tc>
           <w:tcPr>
-            <w:tcW w:type="dxa" w:w="3022"/>
-            <w:shd w:val="clear" w:color="auto" w:fill="F5F7FC"/>
+            <w:tcW w:type="dxa" w:w="2266"/>
+            <w:shd w:val="clear" w:color="auto" w:fill="FFFFFF"/>
           </w:tcPr>
           <w:p>
             <w:r>
@@ -3052,8 +3062,8 @@
         </w:tc>
         <w:tc>
           <w:tcPr>
-            <w:tcW w:type="dxa" w:w="3022"/>
-            <w:shd w:val="clear" w:color="auto" w:fill="F5F7FC"/>
+            <w:tcW w:type="dxa" w:w="2266"/>
+            <w:shd w:val="clear" w:color="auto" w:fill="FFFFFF"/>
           </w:tcPr>
           <w:p>
             <w:r>
@@ -3066,8 +3076,22 @@
         </w:tc>
         <w:tc>
           <w:tcPr>
-            <w:tcW w:type="dxa" w:w="3022"/>
-            <w:shd w:val="clear" w:color="auto" w:fill="F5F7FC"/>
+            <w:tcW w:type="dxa" w:w="2266"/>
+            <w:shd w:val="clear" w:color="auto" w:fill="FFFFFF"/>
+          </w:tcPr>
+          <w:p>
+            <w:r>
+              <w:rPr>
+                <w:sz w:val="19"/>
+              </w:rPr>
+              <w:t>Animal suffering-years / $1M (pre-moral-weight)</w:t>
+            </w:r>
+          </w:p>
+        </w:tc>
+        <w:tc>
+          <w:tcPr>
+            <w:tcW w:type="dxa" w:w="2266"/>
+            <w:shd w:val="clear" w:color="auto" w:fill="FFFFFF"/>
           </w:tcPr>
           <w:p>
             <w:r>

</xml_diff>